<commit_message>
Changes for new contracts
</commit_message>
<xml_diff>
--- a/wwwroot/Templates/Fehle-müqavile2024.docx
+++ b/wwwroot/Templates/Fehle-müqavile2024.docx
@@ -26,63 +26,8 @@
           <w:szCs w:val="24"/>
           <w:lang w:val="az-Latn-AZ"/>
         </w:rPr>
-        <w:t xml:space="preserve"> № </w:t>
-      </w:r>
-      <w:r>
-        <w:rPr>
-          <w:rFonts w:ascii="Arial" w:hAnsi="Arial" w:cs="Arial"/>
-          <w:szCs w:val="24"/>
-          <w:lang w:val="az-Latn-AZ"/>
-        </w:rPr>
-        <w:t>Q</w:t>
-      </w:r>
-      <w:r>
-        <w:rPr>
-          <w:rFonts w:ascii="Arial" w:hAnsi="Arial" w:cs="Arial"/>
-          <w:color w:val="000000" w:themeColor="text1"/>
-          <w:szCs w:val="24"/>
-          <w:lang w:val="az-Latn-AZ"/>
-        </w:rPr>
-        <w:t>FH</w:t>
-      </w:r>
-      <w:r>
-        <w:rPr>
-          <w:rFonts w:ascii="Arial" w:hAnsi="Arial" w:cs="Arial"/>
-          <w:color w:val="000000" w:themeColor="text1"/>
-          <w:szCs w:val="24"/>
-          <w:lang w:val="az-Latn-AZ"/>
-        </w:rPr>
-        <w:t>_________</w:t>
-      </w:r>
-      <w:r>
-        <w:rPr>
-          <w:rFonts w:ascii="Arial" w:hAnsi="Arial" w:cs="Arial"/>
-          <w:color w:val="000000" w:themeColor="text1"/>
-          <w:szCs w:val="24"/>
-          <w:lang w:val="az-Latn-AZ"/>
-        </w:rPr>
-        <w:t>_</w:t>
-      </w:r>
-      <w:r>
-        <w:rPr>
-          <w:rFonts w:ascii="Arial" w:hAnsi="Arial" w:cs="Arial"/>
-          <w:color w:val="000000" w:themeColor="text1"/>
-          <w:szCs w:val="24"/>
-          <w:lang w:val="az-Latn-AZ"/>
-        </w:rPr>
-        <w:t>0</w:t>
-      </w:r>
-      <w:r>
-        <w:rPr>
-          <w:rFonts w:ascii="Arial" w:hAnsi="Arial" w:cs="Arial"/>
-          <w:color w:val="000000" w:themeColor="text1"/>
-          <w:szCs w:val="24"/>
-          <w:lang w:val="az-Latn-AZ"/>
-        </w:rPr>
-        <w:t>5</w:t>
-      </w:r>
-      <w:bookmarkStart w:id="0" w:name="_GoBack"/>
-      <w:bookmarkEnd w:id="0"/>
+        <w:t xml:space="preserve"> №</w:t>
+      </w:r>
     </w:p>
     <w:p>
       <w:pPr>
@@ -340,107 +285,7 @@
           <w:szCs w:val="24"/>
           <w:lang w:val="az-Latn-AZ"/>
         </w:rPr>
-        <w:t>___</w:t>
-      </w:r>
-      <w:r>
-        <w:rPr>
-          <w:rFonts w:ascii="Arial" w:hAnsi="Arial" w:cs="Arial"/>
-          <w:b/>
-          <w:i w:val="0"/>
-          <w:szCs w:val="24"/>
-          <w:lang w:val="az-Latn-AZ"/>
-        </w:rPr>
-        <w:t>/</w:t>
-      </w:r>
-      <w:r>
-        <w:rPr>
-          <w:rFonts w:ascii="Arial" w:hAnsi="Arial" w:cs="Arial"/>
-          <w:b/>
-          <w:i w:val="0"/>
-          <w:szCs w:val="24"/>
-          <w:lang w:val="az-Latn-AZ"/>
-        </w:rPr>
-        <w:t>_</w:t>
-      </w:r>
-      <w:r>
-        <w:rPr>
-          <w:rFonts w:ascii="Arial" w:hAnsi="Arial" w:cs="Arial"/>
-          <w:b/>
-          <w:i w:val="0"/>
-          <w:szCs w:val="24"/>
-          <w:lang w:val="az-Latn-AZ"/>
-        </w:rPr>
-        <w:t>___</w:t>
-      </w:r>
-      <w:r>
-        <w:rPr>
-          <w:rFonts w:ascii="Arial" w:hAnsi="Arial" w:cs="Arial"/>
-          <w:b/>
-          <w:i w:val="0"/>
-          <w:szCs w:val="24"/>
-          <w:lang w:val="az-Latn-AZ"/>
-        </w:rPr>
-        <w:t>___</w:t>
-      </w:r>
-      <w:r>
-        <w:rPr>
-          <w:rFonts w:ascii="Arial" w:hAnsi="Arial" w:cs="Arial"/>
-          <w:b/>
-          <w:i w:val="0"/>
-          <w:szCs w:val="24"/>
-          <w:lang w:val="az-Latn-AZ"/>
-        </w:rPr>
-        <w:t>/</w:t>
-      </w:r>
-      <w:r>
-        <w:rPr>
-          <w:rFonts w:ascii="Arial" w:hAnsi="Arial" w:cs="Arial"/>
-          <w:b/>
-          <w:i w:val="0"/>
-          <w:szCs w:val="24"/>
-          <w:lang w:val="az-Latn-AZ"/>
-        </w:rPr>
-        <w:t>202</w:t>
-      </w:r>
-      <w:r>
-        <w:rPr>
-          <w:rFonts w:ascii="Arial" w:hAnsi="Arial" w:cs="Arial"/>
-          <w:b/>
-          <w:i w:val="0"/>
-          <w:szCs w:val="24"/>
-          <w:lang w:val="az-Latn-AZ"/>
-        </w:rPr>
-        <w:t>5</w:t>
-      </w:r>
-      <w:r>
-        <w:rPr>
-          <w:rFonts w:ascii="Arial" w:hAnsi="Arial" w:cs="Arial"/>
-          <w:b/>
-          <w:i w:val="0"/>
-          <w:szCs w:val="24"/>
-          <w:lang w:val="az-Latn-AZ"/>
-        </w:rPr>
-        <w:t>-c</w:t>
-      </w:r>
-      <w:r>
-        <w:rPr>
-          <w:rFonts w:ascii="Arial" w:hAnsi="Arial" w:cs="Arial"/>
-          <w:b/>
-          <w:i w:val="0"/>
-          <w:szCs w:val="24"/>
-          <w:lang w:val="az-Latn-AZ"/>
-        </w:rPr>
-        <w:t>i</w:t>
-      </w:r>
-      <w:r>
-        <w:rPr>
-          <w:rFonts w:ascii="Arial" w:hAnsi="Arial" w:cs="Arial"/>
-          <w:b/>
-          <w:i w:val="0"/>
-          <w:szCs w:val="24"/>
-          <w:lang w:val="az-Latn-AZ"/>
-        </w:rPr>
-        <w:t xml:space="preserve"> il</w:t>
+        <w:t>Tarix:</w:t>
       </w:r>
     </w:p>
     <w:p>
@@ -726,7 +571,7 @@
           <w:szCs w:val="24"/>
           <w:lang w:val="az-Latn-AZ"/>
         </w:rPr>
-        <w:t>__________________________________________________________</w:t>
+        <w:t>___</w:t>
       </w:r>
       <w:r>
         <w:rPr>
@@ -2229,7 +2074,6 @@
           <w:szCs w:val="24"/>
           <w:lang w:val="az-Latn-AZ"/>
         </w:rPr>
-        <w:lastRenderedPageBreak/>
         <w:t>4.3. Müqaviləyə xitam verilməsi Tərəfləri Müqavilə üzrə icra edilməmiş və ya lazımınca icra edilməmiş öhdəliklərinin icrasından azad etmir.</w:t>
       </w:r>
     </w:p>
@@ -2251,6 +2095,7 @@
           <w:szCs w:val="24"/>
           <w:lang w:val="az-Latn-AZ"/>
         </w:rPr>
+        <w:lastRenderedPageBreak/>
         <w:t>4.4. Bu Müqaviləyə yalnız Tərəflərin qarşılıqlı razılığı ilə əlavə və dəyişikliklər edilə bilər. Tərəflərin imzaları ilə təsdiqləndikdən sonra əlavə və dəyişikliklər qüvvəyə minir və bu Müqavilənin ayrılmaz tərkib hissəsi hesab edilir.</w:t>
       </w:r>
     </w:p>
@@ -2535,7 +2380,7 @@
         </w:trPr>
         <w:tc>
           <w:tcPr>
-            <w:tcW w:w="4263" w:type="dxa"/>
+            <w:tcW w:w="4750" w:type="dxa"/>
             <w:shd w:val="clear" w:color="auto" w:fill="FFFFFF"/>
             <w:tcMar>
               <w:top w:w="0" w:type="dxa"/>
@@ -2871,6 +2716,14 @@
         <w:tblStyle w:val="TableGrid"/>
         <w:tblpPr w:leftFromText="180" w:rightFromText="180" w:vertAnchor="text" w:horzAnchor="margin" w:tblpXSpec="right" w:tblpY="-11"/>
         <w:tblW w:w="0" w:type="auto"/>
+        <w:tblBorders>
+          <w:top w:val="none" w:sz="0" w:space="0" w:color="auto"/>
+          <w:left w:val="none" w:sz="0" w:space="0" w:color="auto"/>
+          <w:bottom w:val="none" w:sz="0" w:space="0" w:color="auto"/>
+          <w:right w:val="none" w:sz="0" w:space="0" w:color="auto"/>
+          <w:insideH w:val="none" w:sz="0" w:space="0" w:color="auto"/>
+          <w:insideV w:val="none" w:sz="0" w:space="0" w:color="auto"/>
+        </w:tblBorders>
         <w:tblLayout w:type="fixed"/>
         <w:tblLook w:val="04A0" w:firstRow="1" w:lastRow="0" w:firstColumn="1" w:lastColumn="0" w:noHBand="0" w:noVBand="1"/>
       </w:tblPr>
@@ -2881,12 +2734,6 @@
         <w:tc>
           <w:tcPr>
             <w:tcW w:w="5954" w:type="dxa"/>
-            <w:tcBorders>
-              <w:top w:val="nil"/>
-              <w:left w:val="nil"/>
-              <w:bottom w:val="nil"/>
-              <w:right w:val="nil"/>
-            </w:tcBorders>
             <w:vAlign w:val="center"/>
           </w:tcPr>
           <w:p>
@@ -2917,12 +2764,6 @@
         <w:tc>
           <w:tcPr>
             <w:tcW w:w="5954" w:type="dxa"/>
-            <w:tcBorders>
-              <w:top w:val="nil"/>
-              <w:left w:val="nil"/>
-              <w:bottom w:val="single" w:sz="4" w:space="0" w:color="auto"/>
-              <w:right w:val="nil"/>
-            </w:tcBorders>
           </w:tcPr>
           <w:p>
             <w:pPr>
@@ -2941,19 +2782,12 @@
         <w:tc>
           <w:tcPr>
             <w:tcW w:w="5954" w:type="dxa"/>
-            <w:tcBorders>
-              <w:top w:val="single" w:sz="4" w:space="0" w:color="auto"/>
-              <w:left w:val="nil"/>
-              <w:bottom w:val="nil"/>
-              <w:right w:val="nil"/>
-            </w:tcBorders>
           </w:tcPr>
           <w:p>
             <w:pPr>
-              <w:jc w:val="center"/>
               <w:rPr>
                 <w:rFonts w:ascii="Arial" w:hAnsi="Arial" w:cs="Arial"/>
-                <w:sz w:val="24"/>
+                <w:sz w:val="22"/>
                 <w:szCs w:val="24"/>
                 <w:lang w:val="az-Latn-AZ"/>
               </w:rPr>
@@ -2965,7 +2799,16 @@
                 <w:szCs w:val="24"/>
                 <w:lang w:val="az-Latn-AZ"/>
               </w:rPr>
-              <w:t>adı, soyadı, atasının adı</w:t>
+              <w:t>S</w:t>
+            </w:r>
+            <w:r>
+              <w:rPr>
+                <w:rFonts w:ascii="Arial" w:hAnsi="Arial" w:cs="Arial"/>
+                <w:sz w:val="22"/>
+                <w:szCs w:val="24"/>
+                <w:lang w:val="az-Latn-AZ"/>
+              </w:rPr>
+              <w:t>oyadı, adı, atasının adı</w:t>
             </w:r>
           </w:p>
         </w:tc>
@@ -2974,16 +2817,9 @@
         <w:tc>
           <w:tcPr>
             <w:tcW w:w="5954" w:type="dxa"/>
-            <w:tcBorders>
-              <w:top w:val="nil"/>
-              <w:left w:val="nil"/>
-              <w:bottom w:val="single" w:sz="4" w:space="0" w:color="auto"/>
-              <w:right w:val="nil"/>
-            </w:tcBorders>
           </w:tcPr>
           <w:p>
             <w:pPr>
-              <w:jc w:val="both"/>
               <w:rPr>
                 <w:rFonts w:ascii="Arial" w:hAnsi="Arial" w:cs="Arial"/>
                 <w:sz w:val="24"/>
@@ -2998,15 +2834,9 @@
         <w:tc>
           <w:tcPr>
             <w:tcW w:w="5954" w:type="dxa"/>
-            <w:tcBorders>
-              <w:left w:val="nil"/>
-              <w:bottom w:val="nil"/>
-              <w:right w:val="nil"/>
-            </w:tcBorders>
           </w:tcPr>
           <w:p>
             <w:pPr>
-              <w:jc w:val="center"/>
               <w:rPr>
                 <w:rFonts w:ascii="Arial" w:hAnsi="Arial" w:cs="Arial"/>
                 <w:sz w:val="22"/>
@@ -3021,7 +2851,16 @@
                 <w:szCs w:val="24"/>
                 <w:lang w:val="az-Latn-AZ"/>
               </w:rPr>
-              <w:t>şəxsiyyət vəsiqəsinin FİN kodu</w:t>
+              <w:t>Ş</w:t>
+            </w:r>
+            <w:r>
+              <w:rPr>
+                <w:rFonts w:ascii="Arial" w:hAnsi="Arial" w:cs="Arial"/>
+                <w:sz w:val="22"/>
+                <w:szCs w:val="24"/>
+                <w:lang w:val="az-Latn-AZ"/>
+              </w:rPr>
+              <w:t>əxsiyyət vəsiqəsinin FİN kodu</w:t>
             </w:r>
           </w:p>
         </w:tc>
@@ -3030,12 +2869,6 @@
         <w:tc>
           <w:tcPr>
             <w:tcW w:w="5954" w:type="dxa"/>
-            <w:tcBorders>
-              <w:top w:val="nil"/>
-              <w:left w:val="nil"/>
-              <w:bottom w:val="single" w:sz="4" w:space="0" w:color="auto"/>
-              <w:right w:val="nil"/>
-            </w:tcBorders>
           </w:tcPr>
           <w:p>
             <w:pPr>
@@ -3053,15 +2886,9 @@
         <w:tc>
           <w:tcPr>
             <w:tcW w:w="5954" w:type="dxa"/>
-            <w:tcBorders>
-              <w:left w:val="nil"/>
-              <w:bottom w:val="nil"/>
-              <w:right w:val="nil"/>
-            </w:tcBorders>
           </w:tcPr>
           <w:p>
             <w:pPr>
-              <w:jc w:val="center"/>
               <w:rPr>
                 <w:rFonts w:ascii="Arial" w:hAnsi="Arial" w:cs="Arial"/>
                 <w:sz w:val="22"/>
@@ -3085,12 +2912,6 @@
         <w:tc>
           <w:tcPr>
             <w:tcW w:w="5954" w:type="dxa"/>
-            <w:tcBorders>
-              <w:top w:val="nil"/>
-              <w:left w:val="nil"/>
-              <w:bottom w:val="single" w:sz="4" w:space="0" w:color="auto"/>
-              <w:right w:val="nil"/>
-            </w:tcBorders>
           </w:tcPr>
           <w:p>
             <w:pPr>
@@ -3108,15 +2929,9 @@
         <w:tc>
           <w:tcPr>
             <w:tcW w:w="5954" w:type="dxa"/>
-            <w:tcBorders>
-              <w:left w:val="nil"/>
-              <w:bottom w:val="nil"/>
-              <w:right w:val="nil"/>
-            </w:tcBorders>
           </w:tcPr>
           <w:p>
             <w:pPr>
-              <w:jc w:val="center"/>
               <w:rPr>
                 <w:rFonts w:ascii="Arial" w:hAnsi="Arial" w:cs="Arial"/>
                 <w:sz w:val="22"/>
@@ -3136,7 +2951,6 @@
           </w:p>
           <w:p>
             <w:pPr>
-              <w:jc w:val="center"/>
               <w:rPr>
                 <w:rFonts w:ascii="Arial" w:hAnsi="Arial" w:cs="Arial"/>
                 <w:sz w:val="22"/>
@@ -3151,118 +2965,28 @@
         <w:tc>
           <w:tcPr>
             <w:tcW w:w="5954" w:type="dxa"/>
-            <w:tcBorders>
-              <w:top w:val="nil"/>
-              <w:left w:val="nil"/>
-              <w:bottom w:val="nil"/>
-              <w:right w:val="nil"/>
-            </w:tcBorders>
           </w:tcPr>
           <w:p>
             <w:pPr>
-              <w:jc w:val="center"/>
               <w:rPr>
                 <w:rFonts w:ascii="Arial" w:hAnsi="Arial" w:cs="Arial"/>
-                <w:b/>
-                <w:bCs/>
                 <w:sz w:val="22"/>
                 <w:szCs w:val="24"/>
-                <w:lang w:val="en-US"/>
+                <w:lang w:val="az-Latn-AZ"/>
               </w:rPr>
             </w:pPr>
             <w:r>
               <w:rPr>
                 <w:rFonts w:ascii="Arial" w:hAnsi="Arial" w:cs="Arial"/>
-                <w:b/>
-                <w:bCs/>
                 <w:sz w:val="22"/>
                 <w:szCs w:val="24"/>
                 <w:lang w:val="az-Latn-AZ"/>
               </w:rPr>
-              <w:t>Bank rekvizitləri</w:t>
-            </w:r>
-            <w:r>
-              <w:rPr>
-                <w:rFonts w:ascii="Arial" w:hAnsi="Arial" w:cs="Arial"/>
-                <w:b/>
-                <w:bCs/>
-                <w:sz w:val="22"/>
-                <w:szCs w:val="24"/>
-                <w:lang w:val="en-US"/>
-              </w:rPr>
-              <w:t xml:space="preserve">: </w:t>
+              <w:t>Bankın Adı</w:t>
             </w:r>
           </w:p>
           <w:p>
             <w:pPr>
-              <w:pBdr>
-                <w:bottom w:val="single" w:sz="4" w:space="1" w:color="auto"/>
-              </w:pBdr>
-              <w:jc w:val="center"/>
-              <w:rPr>
-                <w:rFonts w:ascii="Arial" w:hAnsi="Arial" w:cs="Arial"/>
-                <w:sz w:val="22"/>
-                <w:szCs w:val="24"/>
-                <w:lang w:val="en-US"/>
-              </w:rPr>
-            </w:pPr>
-          </w:p>
-          <w:p>
-            <w:pPr>
-              <w:jc w:val="center"/>
-              <w:rPr>
-                <w:rFonts w:ascii="Arial" w:hAnsi="Arial" w:cs="Arial"/>
-                <w:sz w:val="22"/>
-                <w:szCs w:val="24"/>
-                <w:lang w:val="az-Latn-AZ"/>
-              </w:rPr>
-            </w:pPr>
-            <w:proofErr w:type="spellStart"/>
-            <w:r>
-              <w:rPr>
-                <w:rFonts w:ascii="Arial" w:hAnsi="Arial" w:cs="Arial"/>
-                <w:sz w:val="22"/>
-                <w:szCs w:val="24"/>
-                <w:lang w:val="en-US"/>
-              </w:rPr>
-              <w:t>Bankın</w:t>
-            </w:r>
-            <w:proofErr w:type="spellEnd"/>
-            <w:r>
-              <w:rPr>
-                <w:rFonts w:ascii="Arial" w:hAnsi="Arial" w:cs="Arial"/>
-                <w:sz w:val="22"/>
-                <w:szCs w:val="24"/>
-                <w:lang w:val="en-US"/>
-              </w:rPr>
-              <w:t xml:space="preserve"> ad</w:t>
-            </w:r>
-            <w:r>
-              <w:rPr>
-                <w:rFonts w:ascii="Arial" w:hAnsi="Arial" w:cs="Arial"/>
-                <w:sz w:val="22"/>
-                <w:szCs w:val="24"/>
-                <w:lang w:val="az-Latn-AZ"/>
-              </w:rPr>
-              <w:t>ı</w:t>
-            </w:r>
-          </w:p>
-        </w:tc>
-      </w:tr>
-      <w:tr>
-        <w:tc>
-          <w:tcPr>
-            <w:tcW w:w="5954" w:type="dxa"/>
-            <w:tcBorders>
-              <w:top w:val="nil"/>
-              <w:left w:val="nil"/>
-              <w:bottom w:val="single" w:sz="4" w:space="0" w:color="auto"/>
-              <w:right w:val="nil"/>
-            </w:tcBorders>
-          </w:tcPr>
-          <w:p>
-            <w:pPr>
-              <w:jc w:val="center"/>
               <w:rPr>
                 <w:rFonts w:ascii="Arial" w:hAnsi="Arial" w:cs="Arial"/>
                 <w:sz w:val="22"/>
@@ -3277,15 +3001,9 @@
         <w:tc>
           <w:tcPr>
             <w:tcW w:w="5954" w:type="dxa"/>
-            <w:tcBorders>
-              <w:left w:val="nil"/>
-              <w:bottom w:val="nil"/>
-              <w:right w:val="nil"/>
-            </w:tcBorders>
           </w:tcPr>
           <w:p>
             <w:pPr>
-              <w:jc w:val="center"/>
               <w:rPr>
                 <w:rFonts w:ascii="Arial" w:hAnsi="Arial" w:cs="Arial"/>
                 <w:sz w:val="22"/>
@@ -3309,16 +3027,9 @@
         <w:tc>
           <w:tcPr>
             <w:tcW w:w="5954" w:type="dxa"/>
-            <w:tcBorders>
-              <w:top w:val="nil"/>
-              <w:left w:val="nil"/>
-              <w:bottom w:val="single" w:sz="4" w:space="0" w:color="auto"/>
-              <w:right w:val="nil"/>
-            </w:tcBorders>
           </w:tcPr>
           <w:p>
             <w:pPr>
-              <w:jc w:val="center"/>
               <w:rPr>
                 <w:rFonts w:ascii="Arial" w:hAnsi="Arial" w:cs="Arial"/>
                 <w:sz w:val="22"/>
@@ -3333,15 +3044,9 @@
         <w:tc>
           <w:tcPr>
             <w:tcW w:w="5954" w:type="dxa"/>
-            <w:tcBorders>
-              <w:left w:val="nil"/>
-              <w:bottom w:val="single" w:sz="4" w:space="0" w:color="auto"/>
-              <w:right w:val="nil"/>
-            </w:tcBorders>
           </w:tcPr>
           <w:p>
             <w:pPr>
-              <w:jc w:val="center"/>
               <w:rPr>
                 <w:rFonts w:ascii="Arial" w:hAnsi="Arial" w:cs="Arial"/>
                 <w:sz w:val="22"/>
@@ -3362,7 +3067,6 @@
           <w:p>
             <w:pPr>
               <w:ind w:left="-537" w:right="-536"/>
-              <w:jc w:val="center"/>
               <w:rPr>
                 <w:rFonts w:ascii="Arial" w:hAnsi="Arial" w:cs="Arial"/>
                 <w:sz w:val="22"/>
@@ -3377,15 +3081,9 @@
         <w:tc>
           <w:tcPr>
             <w:tcW w:w="5954" w:type="dxa"/>
-            <w:tcBorders>
-              <w:left w:val="nil"/>
-              <w:bottom w:val="nil"/>
-              <w:right w:val="nil"/>
-            </w:tcBorders>
           </w:tcPr>
           <w:p>
             <w:pPr>
-              <w:jc w:val="center"/>
               <w:rPr>
                 <w:rFonts w:ascii="Arial" w:hAnsi="Arial" w:cs="Arial"/>
                 <w:sz w:val="22"/>
@@ -3409,12 +3107,6 @@
         <w:tc>
           <w:tcPr>
             <w:tcW w:w="5954" w:type="dxa"/>
-            <w:tcBorders>
-              <w:top w:val="nil"/>
-              <w:left w:val="nil"/>
-              <w:bottom w:val="single" w:sz="4" w:space="0" w:color="auto"/>
-              <w:right w:val="nil"/>
-            </w:tcBorders>
           </w:tcPr>
           <w:p>
             <w:pPr>
@@ -3429,7 +3121,7 @@
           </w:p>
           <w:p>
             <w:pPr>
-              <w:jc w:val="both"/>
+              <w:jc w:val="center"/>
               <w:rPr>
                 <w:rFonts w:ascii="Arial" w:hAnsi="Arial" w:cs="Arial"/>
                 <w:sz w:val="22"/>
@@ -3437,6 +3129,15 @@
                 <w:lang w:val="az-Latn-AZ"/>
               </w:rPr>
             </w:pPr>
+            <w:r>
+              <w:rPr>
+                <w:rFonts w:ascii="Arial" w:hAnsi="Arial" w:cs="Arial"/>
+                <w:sz w:val="22"/>
+                <w:szCs w:val="24"/>
+                <w:lang w:val="az-Latn-AZ"/>
+              </w:rPr>
+              <w:t>__________________</w:t>
+            </w:r>
           </w:p>
         </w:tc>
       </w:tr>
@@ -3444,11 +3145,6 @@
         <w:tc>
           <w:tcPr>
             <w:tcW w:w="5954" w:type="dxa"/>
-            <w:tcBorders>
-              <w:left w:val="nil"/>
-              <w:bottom w:val="nil"/>
-              <w:right w:val="nil"/>
-            </w:tcBorders>
             <w:vAlign w:val="bottom"/>
           </w:tcPr>
           <w:p>
@@ -3485,6 +3181,8 @@
           <w:lang w:val="az-Latn-AZ"/>
         </w:rPr>
       </w:pPr>
+      <w:bookmarkStart w:id="0" w:name="_GoBack"/>
+      <w:bookmarkEnd w:id="0"/>
     </w:p>
     <w:p>
       <w:pPr>
@@ -5586,7 +5284,7 @@
 </file>
 
 <file path=customXml/itemProps1.xml><?xml version="1.0" encoding="utf-8"?>
-<ds:datastoreItem xmlns:ds="http://schemas.openxmlformats.org/officeDocument/2006/customXml" ds:itemID="{E09F1419-6420-4345-A570-ED5751A5E7EF}">
+<ds:datastoreItem xmlns:ds="http://schemas.openxmlformats.org/officeDocument/2006/customXml" ds:itemID="{20DB9D7A-241F-407F-B149-1B1F802ABC68}">
   <ds:schemaRefs>
     <ds:schemaRef ds:uri="http://schemas.openxmlformats.org/officeDocument/2006/bibliography"/>
   </ds:schemaRefs>

</xml_diff>

<commit_message>
Timestamp addings and fincode uniqueness changes
</commit_message>
<xml_diff>
--- a/wwwroot/Templates/Fehle-müqavile2024.docx
+++ b/wwwroot/Templates/Fehle-müqavile2024.docx
@@ -1,6 +1,6 @@
 
 <file path=word/document.xml><?xml version="1.0" encoding="utf-8"?>
-<w:document xmlns:wpc="http://schemas.microsoft.com/office/word/2010/wordprocessingCanvas" xmlns:mc="http://schemas.openxmlformats.org/markup-compatibility/2006" xmlns:o="urn:schemas-microsoft-com:office:office" xmlns:r="http://schemas.openxmlformats.org/officeDocument/2006/relationships" xmlns:m="http://schemas.openxmlformats.org/officeDocument/2006/math" xmlns:v="urn:schemas-microsoft-com:vml" xmlns:wp14="http://schemas.microsoft.com/office/word/2010/wordprocessingDrawing" xmlns:wp="http://schemas.openxmlformats.org/drawingml/2006/wordprocessingDrawing" xmlns:w10="urn:schemas-microsoft-com:office:word" xmlns:w="http://schemas.openxmlformats.org/wordprocessingml/2006/main" xmlns:w14="http://schemas.microsoft.com/office/word/2010/wordml" xmlns:w15="http://schemas.microsoft.com/office/word/2012/wordml" xmlns:wpg="http://schemas.microsoft.com/office/word/2010/wordprocessingGroup" xmlns:wpi="http://schemas.microsoft.com/office/word/2010/wordprocessingInk" xmlns:wne="http://schemas.microsoft.com/office/word/2006/wordml" xmlns:wps="http://schemas.microsoft.com/office/word/2010/wordprocessingShape" mc:Ignorable="w14 w15 wp14">
+<w:document xmlns:wpc="http://schemas.microsoft.com/office/word/2010/wordprocessingCanvas" xmlns:cx="http://schemas.microsoft.com/office/drawing/2014/chartex" xmlns:mc="http://schemas.openxmlformats.org/markup-compatibility/2006" xmlns:o="urn:schemas-microsoft-com:office:office" xmlns:r="http://schemas.openxmlformats.org/officeDocument/2006/relationships" xmlns:m="http://schemas.openxmlformats.org/officeDocument/2006/math" xmlns:v="urn:schemas-microsoft-com:vml" xmlns:wp14="http://schemas.microsoft.com/office/word/2010/wordprocessingDrawing" xmlns:wp="http://schemas.openxmlformats.org/drawingml/2006/wordprocessingDrawing" xmlns:w10="urn:schemas-microsoft-com:office:word" xmlns:w="http://schemas.openxmlformats.org/wordprocessingml/2006/main" xmlns:w14="http://schemas.microsoft.com/office/word/2010/wordml" xmlns:w15="http://schemas.microsoft.com/office/word/2012/wordml" xmlns:w16se="http://schemas.microsoft.com/office/word/2015/wordml/symex" xmlns:wpg="http://schemas.microsoft.com/office/word/2010/wordprocessingGroup" xmlns:wpi="http://schemas.microsoft.com/office/word/2010/wordprocessingInk" xmlns:wne="http://schemas.microsoft.com/office/word/2006/wordml" xmlns:wps="http://schemas.microsoft.com/office/word/2010/wordprocessingShape" mc:Ignorable="w14 w15 w16se wp14">
   <w:body>
     <w:p>
       <w:pPr>
@@ -1758,15 +1758,10 @@
     </w:p>
     <w:p>
       <w:pPr>
-        <w:pStyle w:val="ListParagraph"/>
-        <w:numPr>
-          <w:ilvl w:val="0"/>
-          <w:numId w:val="11"/>
-        </w:numPr>
         <w:tabs>
           <w:tab w:val="left" w:pos="426"/>
         </w:tabs>
-        <w:spacing w:line="240" w:lineRule="auto"/>
+        <w:ind w:left="360"/>
         <w:jc w:val="center"/>
         <w:rPr>
           <w:rFonts w:ascii="Arial" w:hAnsi="Arial" w:cs="Arial"/>
@@ -1776,6 +1771,18 @@
           <w:lang w:val="az-Latn-AZ"/>
         </w:rPr>
       </w:pPr>
+      <w:r>
+        <w:rPr>
+          <w:rFonts w:ascii="Arial" w:hAnsi="Arial" w:cs="Arial"/>
+          <w:b/>
+          <w:sz w:val="24"/>
+          <w:szCs w:val="24"/>
+          <w:lang w:val="az-Latn-AZ"/>
+        </w:rPr>
+        <w:t xml:space="preserve">3. </w:t>
+      </w:r>
+      <w:bookmarkStart w:id="0" w:name="_GoBack"/>
+      <w:bookmarkEnd w:id="0"/>
       <w:r>
         <w:rPr>
           <w:rFonts w:ascii="Arial" w:hAnsi="Arial" w:cs="Arial"/>
@@ -3181,8 +3188,6 @@
           <w:lang w:val="az-Latn-AZ"/>
         </w:rPr>
       </w:pPr>
-      <w:bookmarkStart w:id="0" w:name="_GoBack"/>
-      <w:bookmarkEnd w:id="0"/>
     </w:p>
     <w:p>
       <w:pPr>
@@ -3205,8 +3210,8 @@
 </file>
 
 <file path=word/numbering.xml><?xml version="1.0" encoding="utf-8"?>
-<w:numbering xmlns:wpc="http://schemas.microsoft.com/office/word/2010/wordprocessingCanvas" xmlns:mc="http://schemas.openxmlformats.org/markup-compatibility/2006" xmlns:o="urn:schemas-microsoft-com:office:office" xmlns:r="http://schemas.openxmlformats.org/officeDocument/2006/relationships" xmlns:m="http://schemas.openxmlformats.org/officeDocument/2006/math" xmlns:v="urn:schemas-microsoft-com:vml" xmlns:wp14="http://schemas.microsoft.com/office/word/2010/wordprocessingDrawing" xmlns:wp="http://schemas.openxmlformats.org/drawingml/2006/wordprocessingDrawing" xmlns:w10="urn:schemas-microsoft-com:office:word" xmlns:w="http://schemas.openxmlformats.org/wordprocessingml/2006/main" xmlns:w14="http://schemas.microsoft.com/office/word/2010/wordml" xmlns:w15="http://schemas.microsoft.com/office/word/2012/wordml" xmlns:wpg="http://schemas.microsoft.com/office/word/2010/wordprocessingGroup" xmlns:wpi="http://schemas.microsoft.com/office/word/2010/wordprocessingInk" xmlns:wne="http://schemas.microsoft.com/office/word/2006/wordml" xmlns:wps="http://schemas.microsoft.com/office/word/2010/wordprocessingShape" mc:Ignorable="w14 w15 wp14">
-  <w:abstractNum w:abstractNumId="0">
+<w:numbering xmlns:wpc="http://schemas.microsoft.com/office/word/2010/wordprocessingCanvas" xmlns:cx="http://schemas.microsoft.com/office/drawing/2014/chartex" xmlns:mc="http://schemas.openxmlformats.org/markup-compatibility/2006" xmlns:o="urn:schemas-microsoft-com:office:office" xmlns:r="http://schemas.openxmlformats.org/officeDocument/2006/relationships" xmlns:m="http://schemas.openxmlformats.org/officeDocument/2006/math" xmlns:v="urn:schemas-microsoft-com:vml" xmlns:wp14="http://schemas.microsoft.com/office/word/2010/wordprocessingDrawing" xmlns:wp="http://schemas.openxmlformats.org/drawingml/2006/wordprocessingDrawing" xmlns:w10="urn:schemas-microsoft-com:office:word" xmlns:w="http://schemas.openxmlformats.org/wordprocessingml/2006/main" xmlns:w14="http://schemas.microsoft.com/office/word/2010/wordml" xmlns:w15="http://schemas.microsoft.com/office/word/2012/wordml" xmlns:w16se="http://schemas.microsoft.com/office/word/2015/wordml/symex" xmlns:wpg="http://schemas.microsoft.com/office/word/2010/wordprocessingGroup" xmlns:wpi="http://schemas.microsoft.com/office/word/2010/wordprocessingInk" xmlns:wne="http://schemas.microsoft.com/office/word/2006/wordml" xmlns:wps="http://schemas.microsoft.com/office/word/2010/wordprocessingShape" mc:Ignorable="w14 w15 w16se wp14">
+  <w:abstractNum w:abstractNumId="0" w15:restartNumberingAfterBreak="0">
     <w:nsid w:val="05B062C6"/>
     <w:multiLevelType w:val="multilevel"/>
     <w:tmpl w:val="53FEC900"/>
@@ -3319,7 +3324,7 @@
       </w:rPr>
     </w:lvl>
   </w:abstractNum>
-  <w:abstractNum w:abstractNumId="1">
+  <w:abstractNum w:abstractNumId="1" w15:restartNumberingAfterBreak="0">
     <w:nsid w:val="0A5C17B4"/>
     <w:multiLevelType w:val="multilevel"/>
     <w:tmpl w:val="DE724754"/>
@@ -3440,7 +3445,7 @@
       </w:rPr>
     </w:lvl>
   </w:abstractNum>
-  <w:abstractNum w:abstractNumId="2">
+  <w:abstractNum w:abstractNumId="2" w15:restartNumberingAfterBreak="0">
     <w:nsid w:val="16F31115"/>
     <w:multiLevelType w:val="hybridMultilevel"/>
     <w:tmpl w:val="53D6AD16"/>
@@ -3554,7 +3559,7 @@
       </w:rPr>
     </w:lvl>
   </w:abstractNum>
-  <w:abstractNum w:abstractNumId="3">
+  <w:abstractNum w:abstractNumId="3" w15:restartNumberingAfterBreak="0">
     <w:nsid w:val="19615784"/>
     <w:multiLevelType w:val="multilevel"/>
     <w:tmpl w:val="3B3E4138"/>
@@ -3667,7 +3672,7 @@
       </w:rPr>
     </w:lvl>
   </w:abstractNum>
-  <w:abstractNum w:abstractNumId="4">
+  <w:abstractNum w:abstractNumId="4" w15:restartNumberingAfterBreak="0">
     <w:nsid w:val="381C45AE"/>
     <w:multiLevelType w:val="hybridMultilevel"/>
     <w:tmpl w:val="2E527DB6"/>
@@ -3780,7 +3785,7 @@
       </w:rPr>
     </w:lvl>
   </w:abstractNum>
-  <w:abstractNum w:abstractNumId="5">
+  <w:abstractNum w:abstractNumId="5" w15:restartNumberingAfterBreak="0">
     <w:nsid w:val="4CB87D44"/>
     <w:multiLevelType w:val="hybridMultilevel"/>
     <w:tmpl w:val="E47020A0"/>
@@ -3869,7 +3874,7 @@
       </w:pPr>
     </w:lvl>
   </w:abstractNum>
-  <w:abstractNum w:abstractNumId="6">
+  <w:abstractNum w:abstractNumId="6" w15:restartNumberingAfterBreak="0">
     <w:nsid w:val="51514890"/>
     <w:multiLevelType w:val="hybridMultilevel"/>
     <w:tmpl w:val="D84C7E50"/>
@@ -3986,7 +3991,7 @@
       </w:pPr>
     </w:lvl>
   </w:abstractNum>
-  <w:abstractNum w:abstractNumId="7">
+  <w:abstractNum w:abstractNumId="7" w15:restartNumberingAfterBreak="0">
     <w:nsid w:val="52AA12AA"/>
     <w:multiLevelType w:val="singleLevel"/>
     <w:tmpl w:val="83A25A22"/>
@@ -4001,7 +4006,7 @@
       </w:pPr>
     </w:lvl>
   </w:abstractNum>
-  <w:abstractNum w:abstractNumId="8">
+  <w:abstractNum w:abstractNumId="8" w15:restartNumberingAfterBreak="0">
     <w:nsid w:val="558C2C34"/>
     <w:multiLevelType w:val="multilevel"/>
     <w:tmpl w:val="295E40A8"/>
@@ -4114,7 +4119,7 @@
       </w:rPr>
     </w:lvl>
   </w:abstractNum>
-  <w:abstractNum w:abstractNumId="9">
+  <w:abstractNum w:abstractNumId="9" w15:restartNumberingAfterBreak="0">
     <w:nsid w:val="67186052"/>
     <w:multiLevelType w:val="hybridMultilevel"/>
     <w:tmpl w:val="D1AC43BC"/>
@@ -4232,7 +4237,7 @@
       </w:pPr>
     </w:lvl>
   </w:abstractNum>
-  <w:abstractNum w:abstractNumId="10">
+  <w:abstractNum w:abstractNumId="10" w15:restartNumberingAfterBreak="0">
     <w:nsid w:val="7084424C"/>
     <w:multiLevelType w:val="hybridMultilevel"/>
     <w:tmpl w:val="1DB06EEA"/>
@@ -4397,7 +4402,7 @@
 </file>
 
 <file path=word/styles.xml><?xml version="1.0" encoding="utf-8"?>
-<w:styles xmlns:mc="http://schemas.openxmlformats.org/markup-compatibility/2006" xmlns:r="http://schemas.openxmlformats.org/officeDocument/2006/relationships" xmlns:w="http://schemas.openxmlformats.org/wordprocessingml/2006/main" xmlns:w14="http://schemas.microsoft.com/office/word/2010/wordml" xmlns:w15="http://schemas.microsoft.com/office/word/2012/wordml" mc:Ignorable="w14 w15">
+<w:styles xmlns:mc="http://schemas.openxmlformats.org/markup-compatibility/2006" xmlns:r="http://schemas.openxmlformats.org/officeDocument/2006/relationships" xmlns:w="http://schemas.openxmlformats.org/wordprocessingml/2006/main" xmlns:w14="http://schemas.microsoft.com/office/word/2010/wordml" xmlns:w15="http://schemas.microsoft.com/office/word/2012/wordml" xmlns:w16se="http://schemas.microsoft.com/office/word/2015/wordml/symex" mc:Ignorable="w14 w15 w16se">
   <w:docDefaults>
     <w:rPrDefault>
       <w:rPr>
@@ -4919,7 +4924,6 @@
     <w:basedOn w:val="TableNormal"/>
     <w:rsid w:val="003775AD"/>
     <w:tblPr>
-      <w:tblInd w:w="0" w:type="dxa"/>
       <w:tblBorders>
         <w:top w:val="single" w:sz="4" w:space="0" w:color="auto"/>
         <w:left w:val="single" w:sz="4" w:space="0" w:color="auto"/>
@@ -4928,12 +4932,6 @@
         <w:insideH w:val="single" w:sz="4" w:space="0" w:color="auto"/>
         <w:insideV w:val="single" w:sz="4" w:space="0" w:color="auto"/>
       </w:tblBorders>
-      <w:tblCellMar>
-        <w:top w:w="0" w:type="dxa"/>
-        <w:left w:w="108" w:type="dxa"/>
-        <w:bottom w:w="0" w:type="dxa"/>
-        <w:right w:w="108" w:type="dxa"/>
-      </w:tblCellMar>
     </w:tblPr>
   </w:style>
   <w:style w:type="paragraph" w:styleId="Revision">
@@ -5284,7 +5282,7 @@
 </file>
 
 <file path=customXml/itemProps1.xml><?xml version="1.0" encoding="utf-8"?>
-<ds:datastoreItem xmlns:ds="http://schemas.openxmlformats.org/officeDocument/2006/customXml" ds:itemID="{20DB9D7A-241F-407F-B149-1B1F802ABC68}">
+<ds:datastoreItem xmlns:ds="http://schemas.openxmlformats.org/officeDocument/2006/customXml" ds:itemID="{D8C2E589-54A5-41B0-932B-EBCE9EBAB9AE}">
   <ds:schemaRefs>
     <ds:schemaRef ds:uri="http://schemas.openxmlformats.org/officeDocument/2006/bibliography"/>
   </ds:schemaRefs>

</xml_diff>